<commit_message>
Report and trackers: record the six-part remediation (IP sale tracker rev 13)
Co-Authored-By: Claude Opus 5 <noreply@anthropic.com>
Claude-Session: https://claude.ai/code/session_01W9UtE7X76spacWeSvBH7tv
</commit_message>
<xml_diff>
--- a/research/FIGURE_DRIFT_ROOT_CAUSE.docx
+++ b/research/FIGURE_DRIFT_ROOT_CAUSE.docx
@@ -3107,6 +3107,1163 @@
       </w:pPr>
       <w:r>
         <w:t xml:space="preserve">what the browser actually does.</w:t>
+      </w:r>
+    </w:p>
+    <w:p>
+      <w:pPr>
+        <w:pBdr>
+          <w:bottom w:val="single" w:sz="6" w:space="1" w:color="AAAAAA"/>
+        </w:pBdr>
+      </w:pPr>
+    </w:p>
+    <w:p>
+      <w:pPr>
+        <w:pStyle w:val="Heading2"/>
+        <w:spacing w:after="140"/>
+      </w:pPr>
+      <w:r>
+        <w:t xml:space="preserve">IMPLEMENTED 2026-08-15, all six parts, approved by Phillip</w:t>
+      </w:r>
+    </w:p>
+    <w:tbl>
+      <w:tblPr>
+        <w:tblStyle w:val="TableGrid"/>
+        <w:tblW w:w="9360" w:type="dxa"/>
+        <w:tblBorders>
+          <w:top w:val="single" w:sz="4" w:space="0" w:color="999999"/>
+          <w:left w:val="single" w:sz="4" w:space="0" w:color="999999"/>
+          <w:bottom w:val="single" w:sz="4" w:space="0" w:color="999999"/>
+          <w:right w:val="single" w:sz="4" w:space="0" w:color="999999"/>
+          <w:insideH w:val="single" w:sz="4" w:space="0" w:color="999999"/>
+          <w:insideV w:val="single" w:sz="4" w:space="0" w:color="999999"/>
+        </w:tblBorders>
+      </w:tblPr>
+      <w:tblGrid>
+        <w:gridCol w:w="2340"/>
+        <w:gridCol w:w="2340"/>
+        <w:gridCol w:w="2340"/>
+        <w:gridCol w:w="2340"/>
+      </w:tblGrid>
+      <w:tr>
+        <w:tc>
+          <w:tcPr>
+            <w:tcW w:w="2340" w:type="dxa"/>
+          </w:tcPr>
+          <w:p>
+            <w:pPr>
+              <w:spacing w:after="0"/>
+            </w:pPr>
+            <w:r>
+              <w:t xml:space="preserve">Part</w:t>
+            </w:r>
+          </w:p>
+        </w:tc>
+        <w:tc>
+          <w:tcPr>
+            <w:tcW w:w="2340" w:type="dxa"/>
+          </w:tcPr>
+          <w:p>
+            <w:pPr>
+              <w:spacing w:after="0"/>
+            </w:pPr>
+            <w:r>
+              <w:t xml:space="preserve">Done</w:t>
+            </w:r>
+          </w:p>
+        </w:tc>
+        <w:tc>
+          <w:tcPr>
+            <w:tcW w:w="2340" w:type="dxa"/>
+          </w:tcPr>
+          <w:p>
+            <w:pPr>
+              <w:spacing w:after="0"/>
+            </w:pPr>
+            <w:r>
+              <w:t xml:space="preserve">Where</w:t>
+            </w:r>
+          </w:p>
+        </w:tc>
+        <w:tc>
+          <w:tcPr>
+            <w:tcW w:w="2340" w:type="dxa"/>
+          </w:tcPr>
+          <w:p>
+            <w:pPr>
+              <w:spacing w:after="0"/>
+            </w:pPr>
+            <w:r>
+              <w:t/>
+            </w:r>
+          </w:p>
+        </w:tc>
+      </w:tr>
+      <w:tr>
+        <w:tc>
+          <w:tcPr>
+            <w:tcW w:w="2340" w:type="dxa"/>
+          </w:tcPr>
+          <w:p>
+            <w:pPr>
+              <w:spacing w:after="0"/>
+            </w:pPr>
+            <w:r>
+              <w:t xml:space="preserve">1 Scope naming</w:t>
+            </w:r>
+          </w:p>
+        </w:tc>
+        <w:tc>
+          <w:tcPr>
+            <w:tcW w:w="2340" w:type="dxa"/>
+          </w:tcPr>
+          <w:p>
+            <w:pPr>
+              <w:spacing w:after="0"/>
+            </w:pPr>
+            <w:r>
+              <w:t xml:space="preserve">yes</w:t>
+            </w:r>
+          </w:p>
+        </w:tc>
+        <w:tc>
+          <w:tcPr>
+            <w:tcW w:w="2340" w:type="dxa"/>
+          </w:tcPr>
+          <w:p>
+            <w:pPr>
+              <w:spacing w:after="0"/>
+            </w:pPr>
+            <w:r>
+              <w:rPr>
+                <w:rFonts w:ascii="Consolas" w:hAnsi="Consolas"/>
+              </w:rPr>
+              <w:t xml:space="preserve">api/panel-stats.js</w:t>
+            </w:r>
+            <w:r>
+              <w:t xml:space="preserve">, 9 scoped keys + </w:t>
+            </w:r>
+            <w:r>
+              <w:rPr>
+                <w:rFonts w:ascii="Consolas" w:hAnsi="Consolas"/>
+              </w:rPr>
+              <w:t xml:space="preserve">scope_labels</w:t>
+            </w:r>
+            <w:r>
+              <w:t xml:space="preserve">, every old key kept as an alias assigned from the same expression</w:t>
+            </w:r>
+          </w:p>
+        </w:tc>
+        <w:tc>
+          <w:tcPr>
+            <w:tcW w:w="2340" w:type="dxa"/>
+          </w:tcPr>
+          <w:p>
+            <w:pPr>
+              <w:spacing w:after="0"/>
+            </w:pPr>
+            <w:r>
+              <w:t/>
+            </w:r>
+          </w:p>
+        </w:tc>
+      </w:tr>
+      <w:tr>
+        <w:tc>
+          <w:tcPr>
+            <w:tcW w:w="2340" w:type="dxa"/>
+          </w:tcPr>
+          <w:p>
+            <w:pPr>
+              <w:spacing w:after="0"/>
+            </w:pPr>
+            <w:r>
+              <w:t xml:space="preserve">2 Bind prose and show the scope</w:t>
+            </w:r>
+          </w:p>
+        </w:tc>
+        <w:tc>
+          <w:tcPr>
+            <w:tcW w:w="2340" w:type="dxa"/>
+          </w:tcPr>
+          <w:p>
+            <w:pPr>
+              <w:spacing w:after="0"/>
+            </w:pPr>
+            <w:r>
+              <w:t xml:space="preserve">yes</w:t>
+            </w:r>
+          </w:p>
+        </w:tc>
+        <w:tc>
+          <w:tcPr>
+            <w:tcW w:w="2340" w:type="dxa"/>
+          </w:tcPr>
+          <w:p>
+            <w:pPr>
+              <w:spacing w:after="0"/>
+            </w:pPr>
+            <w:r>
+              <w:t xml:space="preserve">13 frozen claims bound across 7 pages; 45 bound spans on 10 pages</w:t>
+            </w:r>
+          </w:p>
+        </w:tc>
+        <w:tc>
+          <w:tcPr>
+            <w:tcW w:w="2340" w:type="dxa"/>
+          </w:tcPr>
+          <w:p>
+            <w:pPr>
+              <w:spacing w:after="0"/>
+            </w:pPr>
+            <w:r>
+              <w:t/>
+            </w:r>
+          </w:p>
+        </w:tc>
+      </w:tr>
+      <w:tr>
+        <w:tc>
+          <w:tcPr>
+            <w:tcW w:w="2340" w:type="dxa"/>
+          </w:tcPr>
+          <w:p>
+            <w:pPr>
+              <w:spacing w:after="0"/>
+            </w:pPr>
+            <w:r>
+              <w:t xml:space="preserve">3 Unify binders</w:t>
+            </w:r>
+          </w:p>
+        </w:tc>
+        <w:tc>
+          <w:tcPr>
+            <w:tcW w:w="2340" w:type="dxa"/>
+          </w:tcPr>
+          <w:p>
+            <w:pPr>
+              <w:spacing w:after="0"/>
+            </w:pPr>
+            <w:r>
+              <w:t xml:space="preserve">yes</w:t>
+            </w:r>
+          </w:p>
+        </w:tc>
+        <w:tc>
+          <w:tcPr>
+            <w:tcW w:w="2340" w:type="dxa"/>
+          </w:tcPr>
+          <w:p>
+            <w:pPr>
+              <w:spacing w:after="0"/>
+            </w:pPr>
+            <w:r>
+              <w:t xml:space="preserve">one canonical delimited block, byte-identical on 10 pages, asserted by the guard</w:t>
+            </w:r>
+          </w:p>
+        </w:tc>
+        <w:tc>
+          <w:tcPr>
+            <w:tcW w:w="2340" w:type="dxa"/>
+          </w:tcPr>
+          <w:p>
+            <w:pPr>
+              <w:spacing w:after="0"/>
+            </w:pPr>
+            <w:r>
+              <w:t/>
+            </w:r>
+          </w:p>
+        </w:tc>
+      </w:tr>
+      <w:tr>
+        <w:tc>
+          <w:tcPr>
+            <w:tcW w:w="2340" w:type="dxa"/>
+          </w:tcPr>
+          <w:p>
+            <w:pPr>
+              <w:spacing w:after="0"/>
+            </w:pPr>
+            <w:r>
+              <w:t xml:space="preserve">4 Extend the guard</w:t>
+            </w:r>
+          </w:p>
+        </w:tc>
+        <w:tc>
+          <w:tcPr>
+            <w:tcW w:w="2340" w:type="dxa"/>
+          </w:tcPr>
+          <w:p>
+            <w:pPr>
+              <w:spacing w:after="0"/>
+            </w:pPr>
+            <w:r>
+              <w:t xml:space="preserve">yes</w:t>
+            </w:r>
+          </w:p>
+        </w:tc>
+        <w:tc>
+          <w:tcPr>
+            <w:tcW w:w="2340" w:type="dxa"/>
+          </w:tcPr>
+          <w:p>
+            <w:pPr>
+              <w:spacing w:after="0"/>
+            </w:pPr>
+            <w:r>
+              <w:t xml:space="preserve">2 new offline checks over all 70 HTML files</w:t>
+            </w:r>
+          </w:p>
+        </w:tc>
+        <w:tc>
+          <w:tcPr>
+            <w:tcW w:w="2340" w:type="dxa"/>
+          </w:tcPr>
+          <w:p>
+            <w:pPr>
+              <w:spacing w:after="0"/>
+            </w:pPr>
+            <w:r>
+              <w:t/>
+            </w:r>
+          </w:p>
+        </w:tc>
+      </w:tr>
+      <w:tr>
+        <w:tc>
+          <w:tcPr>
+            <w:tcW w:w="2340" w:type="dxa"/>
+          </w:tcPr>
+          <w:p>
+            <w:pPr>
+              <w:spacing w:after="0"/>
+            </w:pPr>
+            <w:r>
+              <w:t xml:space="preserve">5 Fallback policy</w:t>
+            </w:r>
+          </w:p>
+        </w:tc>
+        <w:tc>
+          <w:tcPr>
+            <w:tcW w:w="2340" w:type="dxa"/>
+          </w:tcPr>
+          <w:p>
+            <w:pPr>
+              <w:spacing w:after="0"/>
+            </w:pPr>
+            <w:r>
+              <w:rPr>
+                <w:b/>
+              </w:rPr>
+              <w:t xml:space="preserve">mark</w:t>
+            </w:r>
+            <w:r>
+              <w:t xml:space="preserve">, with the reason</w:t>
+            </w:r>
+          </w:p>
+        </w:tc>
+        <w:tc>
+          <w:tcPr>
+            <w:tcW w:w="2340" w:type="dxa"/>
+          </w:tcPr>
+          <w:p>
+            <w:pPr>
+              <w:spacing w:after="0"/>
+            </w:pPr>
+            <w:r>
+              <w:t xml:space="preserve">`data-panel-state=live\</w:t>
+            </w:r>
+          </w:p>
+        </w:tc>
+        <w:tc>
+          <w:tcPr>
+            <w:tcW w:w="2340" w:type="dxa"/>
+          </w:tcPr>
+          <w:p>
+            <w:pPr>
+              <w:spacing w:after="0"/>
+            </w:pPr>
+            <w:r>
+              <w:t xml:space="preserve">stale</w:t>
+            </w:r>
+            <w:r>
+              <w:rPr>
+                <w:rFonts w:ascii="Consolas" w:hAnsi="Consolas"/>
+              </w:rPr>
+              <w:t xml:space="preserve">, dotted underline when stale, </w:t>
+            </w:r>
+            <w:r>
+              <w:t xml:space="preserve">title` giving the read time and scope or the reason it is missing</w:t>
+            </w:r>
+          </w:p>
+        </w:tc>
+      </w:tr>
+      <w:tr>
+        <w:tc>
+          <w:tcPr>
+            <w:tcW w:w="2340" w:type="dxa"/>
+          </w:tcPr>
+          <w:p>
+            <w:pPr>
+              <w:spacing w:after="0"/>
+            </w:pPr>
+            <w:r>
+              <w:t xml:space="preserve">6 As-of dates</w:t>
+            </w:r>
+          </w:p>
+        </w:tc>
+        <w:tc>
+          <w:tcPr>
+            <w:tcW w:w="2340" w:type="dxa"/>
+          </w:tcPr>
+          <w:p>
+            <w:pPr>
+              <w:spacing w:after="0"/>
+            </w:pPr>
+            <w:r>
+              <w:t xml:space="preserve">yes</w:t>
+            </w:r>
+          </w:p>
+        </w:tc>
+        <w:tc>
+          <w:tcPr>
+            <w:tcW w:w="2340" w:type="dxa"/>
+          </w:tcPr>
+          <w:p>
+            <w:pPr>
+              <w:spacing w:after="0"/>
+            </w:pPr>
+            <w:r>
+              <w:rPr>
+                <w:rFonts w:ascii="Consolas" w:hAnsi="Consolas"/>
+              </w:rPr>
+              <w:t xml:space="preserve">data-panel-generated</w:t>
+            </w:r>
+            <w:r>
+              <w:t xml:space="preserve"> renders </w:t>
+            </w:r>
+            <w:r>
+              <w:rPr>
+                <w:rFonts w:ascii="Consolas" w:hAnsi="Consolas"/>
+              </w:rPr>
+              <w:t xml:space="preserve">generated_at</w:t>
+            </w:r>
+          </w:p>
+        </w:tc>
+        <w:tc>
+          <w:tcPr>
+            <w:tcW w:w="2340" w:type="dxa"/>
+          </w:tcPr>
+          <w:p>
+            <w:pPr>
+              <w:spacing w:after="0"/>
+            </w:pPr>
+            <w:r>
+              <w:t/>
+            </w:r>
+          </w:p>
+        </w:tc>
+      </w:tr>
+    </w:tbl>
+    <w:p>
+      <w:pPr/>
+      <w:r>
+        <w:t/>
+      </w:r>
+    </w:p>
+    <w:p>
+      <w:pPr>
+        <w:pStyle w:val="Heading3"/>
+        <w:spacing w:after="140"/>
+      </w:pPr>
+      <w:r>
+        <w:t xml:space="preserve">The headline case, before and after</w:t>
+      </w:r>
+    </w:p>
+    <w:p>
+      <w:pPr>
+        <w:spacing w:after="140"/>
+      </w:pPr>
+      <w:r>
+        <w:rPr>
+          <w:b/>
+        </w:rPr>
+        <w:t xml:space="preserve">Before.</w:t>
+      </w:r>
+      <w:r>
+        <w:t xml:space="preserve"> </w:t>
+      </w:r>
+      <w:r>
+        <w:rPr>
+          <w:rFonts w:ascii="Consolas" w:hAnsi="Consolas"/>
+        </w:rPr>
+        <w:t xml:space="preserve">research.html</w:t>
+      </w:r>
+      <w:r>
+        <w:t xml:space="preserve"> line 108 said </w:t>
+      </w:r>
+      <w:r>
+        <w:rPr>
+          <w:i/>
+        </w:rPr>
+        <w:t xml:space="preserve">"36 of them completed a full 24-record set, spanning 16 countries"</w:t>
+      </w:r>
+      <w:r>
+        <w:t xml:space="preserve"> (bound). Line 160 said </w:t>
+      </w:r>
+      <w:r>
+        <w:rPr>
+          <w:i/>
+        </w:rPr>
+        <w:t xml:space="preserve">"Sixteen reviewers across 11 countries and 5 continents have completed the full 24-record set"</w:t>
+      </w:r>
+      <w:r>
+        <w:t xml:space="preserve"> (frozen).</w:t>
+      </w:r>
+    </w:p>
+    <w:p>
+      <w:pPr>
+        <w:spacing w:after="140"/>
+      </w:pPr>
+      <w:r>
+        <w:rPr>
+          <w:b/>
+        </w:rPr>
+        <w:t xml:space="preserve">After.</w:t>
+      </w:r>
+      <w:r>
+        <w:t xml:space="preserve"> Line 108 reads </w:t>
+      </w:r>
+      <w:r>
+        <w:rPr>
+          <w:i/>
+        </w:rPr>
+        <w:t xml:space="preserve">"36 of them (all completers, both arms) completed a full 24-record set, spanning 16 countries and 5 continents. Counted from the study database at [generated_at]."</w:t>
+      </w:r>
+      <w:r>
+        <w:t xml:space="preserve"> Line 160 reads </w:t>
+      </w:r>
+      <w:r>
+        <w:rPr>
+          <w:i/>
+        </w:rPr>
+        <w:t xml:space="preserve">"The detection panel, 16 reviewers across 11 countries and 5 continents, has completed the full 24-record set."</w:t>
+      </w:r>
+      <w:r>
+        <w:t xml:space="preserve"> Every figure in both sentences is live, and each sentence names its population.</w:t>
+      </w:r>
+    </w:p>
+    <w:p>
+      <w:pPr>
+        <w:pStyle w:val="Heading3"/>
+        <w:spacing w:after="140"/>
+      </w:pPr>
+      <w:r>
+        <w:rPr>
+          <w:rFonts w:ascii="Consolas" w:hAnsi="Consolas"/>
+        </w:rPr>
+        <w:t xml:space="preserve">continents_detection</w:t>
+      </w:r>
+      <w:r>
+        <w:t xml:space="preserve"> was new</w:t>
+      </w:r>
+    </w:p>
+    <w:p>
+      <w:pPr>
+        <w:spacing w:after="140"/>
+      </w:pPr>
+      <w:r>
+        <w:t xml:space="preserve">Eight of the nine scoped keys are renames of values the endpoint already returned. </w:t>
+      </w:r>
+      <w:r>
+        <w:rPr>
+          <w:rFonts w:ascii="Consolas" w:hAnsi="Consolas"/>
+        </w:rPr>
+        <w:t xml:space="preserve">continents_detection</w:t>
+      </w:r>
+      <w:r>
+        <w:t xml:space="preserve"> was the one figure of the set with no key at all, which is precisely why it stayed hardcoded on four pages. It is the same </w:t>
+      </w:r>
+      <w:r>
+        <w:rPr>
+          <w:rFonts w:ascii="Consolas" w:hAnsi="Consolas"/>
+        </w:rPr>
+        <w:t xml:space="preserve">resolvePanelGeo(codesA)</w:t>
+      </w:r>
+      <w:r>
+        <w:t xml:space="preserve"> call the endpoint already made.</w:t>
+      </w:r>
+    </w:p>
+    <w:p>
+      <w:pPr>
+        <w:pStyle w:val="Heading3"/>
+        <w:spacing w:after="140"/>
+      </w:pPr>
+      <w:r>
+        <w:t xml:space="preserve">The guard was validated adversarially, and two real bugs in it were found that way</w:t>
+      </w:r>
+    </w:p>
+    <w:p>
+      <w:pPr>
+        <w:spacing w:after="140"/>
+      </w:pPr>
+      <w:r>
+        <w:t xml:space="preserve">Eight defects were injected one at a time; all eight failed the guard, and the tree passed clean before and after each.</w:t>
+      </w:r>
+    </w:p>
+    <w:tbl>
+      <w:tblPr>
+        <w:tblStyle w:val="TableGrid"/>
+        <w:tblW w:w="9360" w:type="dxa"/>
+        <w:tblBorders>
+          <w:top w:val="single" w:sz="4" w:space="0" w:color="999999"/>
+          <w:left w:val="single" w:sz="4" w:space="0" w:color="999999"/>
+          <w:bottom w:val="single" w:sz="4" w:space="0" w:color="999999"/>
+          <w:right w:val="single" w:sz="4" w:space="0" w:color="999999"/>
+          <w:insideH w:val="single" w:sz="4" w:space="0" w:color="999999"/>
+          <w:insideV w:val="single" w:sz="4" w:space="0" w:color="999999"/>
+        </w:tblBorders>
+      </w:tblPr>
+      <w:tblGrid>
+        <w:gridCol w:w="4680"/>
+        <w:gridCol w:w="4680"/>
+      </w:tblGrid>
+      <w:tr>
+        <w:tc>
+          <w:tcPr>
+            <w:tcW w:w="4680" w:type="dxa"/>
+          </w:tcPr>
+          <w:p>
+            <w:pPr>
+              <w:spacing w:after="0"/>
+            </w:pPr>
+            <w:r>
+              <w:t xml:space="preserve">Injected</w:t>
+            </w:r>
+          </w:p>
+        </w:tc>
+        <w:tc>
+          <w:tcPr>
+            <w:tcW w:w="4680" w:type="dxa"/>
+          </w:tcPr>
+          <w:p>
+            <w:pPr>
+              <w:spacing w:after="0"/>
+            </w:pPr>
+            <w:r>
+              <w:t xml:space="preserve">Caught by</w:t>
+            </w:r>
+          </w:p>
+        </w:tc>
+      </w:tr>
+      <w:tr>
+        <w:tc>
+          <w:tcPr>
+            <w:tcW w:w="4680" w:type="dxa"/>
+          </w:tcPr>
+          <w:p>
+            <w:pPr>
+              <w:spacing w:after="0"/>
+            </w:pPr>
+            <w:r>
+              <w:t xml:space="preserve">A frozen prose figure on a line that also holds a bound span</w:t>
+            </w:r>
+          </w:p>
+        </w:tc>
+        <w:tc>
+          <w:tcPr>
+            <w:tcW w:w="4680" w:type="dxa"/>
+          </w:tcPr>
+          <w:p>
+            <w:pPr>
+              <w:spacing w:after="0"/>
+            </w:pPr>
+            <w:r>
+              <w:t xml:space="preserve">unbound panel figure</w:t>
+            </w:r>
+          </w:p>
+        </w:tc>
+      </w:tr>
+      <w:tr>
+        <w:tc>
+          <w:tcPr>
+            <w:tcW w:w="4680" w:type="dxa"/>
+          </w:tcPr>
+          <w:p>
+            <w:pPr>
+              <w:spacing w:after="0"/>
+            </w:pPr>
+            <w:r>
+              <w:t xml:space="preserve">A spelled-out figure ("Thirty-six completers")</w:t>
+            </w:r>
+          </w:p>
+        </w:tc>
+        <w:tc>
+          <w:tcPr>
+            <w:tcW w:w="4680" w:type="dxa"/>
+          </w:tcPr>
+          <w:p>
+            <w:pPr>
+              <w:spacing w:after="0"/>
+            </w:pPr>
+            <w:r>
+              <w:t xml:space="preserve">unbound panel figure</w:t>
+            </w:r>
+          </w:p>
+        </w:tc>
+      </w:tr>
+      <w:tr>
+        <w:tc>
+          <w:tcPr>
+            <w:tcW w:w="4680" w:type="dxa"/>
+          </w:tcPr>
+          <w:p>
+            <w:pPr>
+              <w:spacing w:after="0"/>
+            </w:pPr>
+            <w:r>
+              <w:t xml:space="preserve">A numeric figure in fresh prose</w:t>
+            </w:r>
+          </w:p>
+        </w:tc>
+        <w:tc>
+          <w:tcPr>
+            <w:tcW w:w="4680" w:type="dxa"/>
+          </w:tcPr>
+          <w:p>
+            <w:pPr>
+              <w:spacing w:after="0"/>
+            </w:pPr>
+            <w:r>
+              <w:t xml:space="preserve">unbound panel figure</w:t>
+            </w:r>
+          </w:p>
+        </w:tc>
+      </w:tr>
+      <w:tr>
+        <w:tc>
+          <w:tcPr>
+            <w:tcW w:w="4680" w:type="dxa"/>
+          </w:tcPr>
+          <w:p>
+            <w:pPr>
+              <w:spacing w:after="0"/>
+            </w:pPr>
+            <w:r>
+              <w:t xml:space="preserve">One binder copy edited</w:t>
+            </w:r>
+          </w:p>
+        </w:tc>
+        <w:tc>
+          <w:tcPr>
+            <w:tcW w:w="4680" w:type="dxa"/>
+          </w:tcPr>
+          <w:p>
+            <w:pPr>
+              <w:spacing w:after="0"/>
+            </w:pPr>
+            <w:r>
+              <w:t xml:space="preserve">binder copies are byte-identical</w:t>
+            </w:r>
+          </w:p>
+        </w:tc>
+      </w:tr>
+      <w:tr>
+        <w:tc>
+          <w:tcPr>
+            <w:tcW w:w="4680" w:type="dxa"/>
+          </w:tcPr>
+          <w:p>
+            <w:pPr>
+              <w:spacing w:after="0"/>
+            </w:pPr>
+            <w:r>
+              <w:t xml:space="preserve">Binder deleted, spans left behind</w:t>
+            </w:r>
+          </w:p>
+        </w:tc>
+        <w:tc>
+          <w:tcPr>
+            <w:tcW w:w="4680" w:type="dxa"/>
+          </w:tcPr>
+          <w:p>
+            <w:pPr>
+              <w:spacing w:after="0"/>
+            </w:pPr>
+            <w:r>
+              <w:t xml:space="preserve">has data-panel spans but no binder block</w:t>
+            </w:r>
+          </w:p>
+        </w:tc>
+      </w:tr>
+      <w:tr>
+        <w:tc>
+          <w:tcPr>
+            <w:tcW w:w="4680" w:type="dxa"/>
+          </w:tcPr>
+          <w:p>
+            <w:pPr>
+              <w:spacing w:after="0"/>
+            </w:pPr>
+            <w:r>
+              <w:t xml:space="preserve">A key the endpoint does not return</w:t>
+            </w:r>
+          </w:p>
+        </w:tc>
+        <w:tc>
+          <w:tcPr>
+            <w:tcW w:w="4680" w:type="dxa"/>
+          </w:tcPr>
+          <w:p>
+            <w:pPr>
+              <w:spacing w:after="0"/>
+            </w:pPr>
+            <w:r>
+              <w:t xml:space="preserve">not returned by api/panel-stats.js</w:t>
+            </w:r>
+          </w:p>
+        </w:tc>
+      </w:tr>
+      <w:tr>
+        <w:tc>
+          <w:tcPr>
+            <w:tcW w:w="4680" w:type="dxa"/>
+          </w:tcPr>
+          <w:p>
+            <w:pPr>
+              <w:spacing w:after="0"/>
+            </w:pPr>
+            <w:r>
+              <w:rPr>
+                <w:rFonts w:ascii="Consolas" w:hAnsi="Consolas"/>
+              </w:rPr>
+              <w:t xml:space="preserve">data-bound</w:t>
+            </w:r>
+            <w:r>
+              <w:t xml:space="preserve"> marker with no script feeding the id</w:t>
+            </w:r>
+          </w:p>
+        </w:tc>
+        <w:tc>
+          <w:tcPr>
+            <w:tcW w:w="4680" w:type="dxa"/>
+          </w:tcPr>
+          <w:p>
+            <w:pPr>
+              <w:spacing w:after="0"/>
+            </w:pPr>
+            <w:r>
+              <w:t xml:space="preserve">no script on this page assigns it</w:t>
+            </w:r>
+          </w:p>
+        </w:tc>
+      </w:tr>
+      <w:tr>
+        <w:tc>
+          <w:tcPr>
+            <w:tcW w:w="4680" w:type="dxa"/>
+          </w:tcPr>
+          <w:p>
+            <w:pPr>
+              <w:spacing w:after="0"/>
+            </w:pPr>
+            <w:r>
+              <w:rPr>
+                <w:rFonts w:ascii="Consolas" w:hAnsi="Consolas"/>
+              </w:rPr>
+              <w:t xml:space="preserve">data-panel-scope</w:t>
+            </w:r>
+            <w:r>
+              <w:t xml:space="preserve"> with no entry in </w:t>
+            </w:r>
+            <w:r>
+              <w:rPr>
+                <w:rFonts w:ascii="Consolas" w:hAnsi="Consolas"/>
+              </w:rPr>
+              <w:t xml:space="preserve">scope_labels</w:t>
+            </w:r>
+          </w:p>
+        </w:tc>
+        <w:tc>
+          <w:tcPr>
+            <w:tcW w:w="4680" w:type="dxa"/>
+          </w:tcPr>
+          <w:p>
+            <w:pPr>
+              <w:spacing w:after="0"/>
+            </w:pPr>
+            <w:r>
+              <w:t xml:space="preserve">no entry in scope_labels</w:t>
+            </w:r>
+          </w:p>
+        </w:tc>
+      </w:tr>
+    </w:tbl>
+    <w:p>
+      <w:pPr/>
+      <w:r>
+        <w:t/>
+      </w:r>
+    </w:p>
+    <w:p>
+      <w:pPr>
+        <w:spacing w:after="140"/>
+      </w:pPr>
+      <w:r>
+        <w:rPr>
+          <w:b/>
+        </w:rPr>
+        <w:t xml:space="preserve">Case A passed on the first attempt, which was the check being wrong.</w:t>
+      </w:r>
+      <w:r>
+        <w:t xml:space="preserve"> It was line-granular, so one bound span shielded every frozen figure sharing its line: exactly the shape of </w:t>
+      </w:r>
+      <w:r>
+        <w:rPr>
+          <w:rFonts w:ascii="Consolas" w:hAnsi="Consolas"/>
+        </w:rPr>
+        <w:t xml:space="preserve">acquisition-9f3c2a7d4b.html</w:t>
+      </w:r>
+      <w:r>
+        <w:t xml:space="preserve"> line 116, half bound and half frozen in a single sentence. Bound elements are now removed from the text before scanning, and replaced with a marker rather than whitespace, because a plain space let a match run through a bound span and report "384 graded reads" as an expert count.</w:t>
+      </w:r>
+    </w:p>
+    <w:p>
+      <w:pPr>
+        <w:spacing w:after="140"/>
+      </w:pPr>
+      <w:r>
+        <w:t xml:space="preserve">Two further corrections came out of the same pass: the scan read only the 50 pages in the repository root and missed </w:t>
+      </w:r>
+      <w:r>
+        <w:rPr>
+          <w:rFonts w:ascii="Consolas" w:hAnsi="Consolas"/>
+        </w:rPr>
+        <w:t xml:space="preserve">reviewer/</w:t>
+      </w:r>
+      <w:r>
+        <w:t xml:space="preserve"> and the whole </w:t>
+      </w:r>
+      <w:r>
+        <w:rPr>
+          <w:rFonts w:ascii="Consolas" w:hAnsi="Consolas"/>
+        </w:rPr>
+        <w:t xml:space="preserve">reference/</w:t>
+      </w:r>
+      <w:r>
+        <w:t xml:space="preserve"> hub, which is where a sixth binder copy and one more frozen figure were sitting; and </w:t>
+      </w:r>
+      <w:r>
+        <w:rPr>
+          <w:rFonts w:ascii="Consolas" w:hAnsi="Consolas"/>
+        </w:rPr>
+        <w:t xml:space="preserve">re.I</w:t>
+      </w:r>
+      <w:r>
+        <w:t xml:space="preserve">, added for the spelled-out numbers, silently made </w:t>
+      </w:r>
+      <w:r>
+        <w:rPr>
+          <w:rFonts w:ascii="Consolas" w:hAnsi="Consolas"/>
+        </w:rPr>
+        <w:t xml:space="preserve">[a-z]</w:t>
+      </w:r>
+      <w:r>
+        <w:t xml:space="preserve"> match capitals and brought 12 headings back as false failures. Only the number words are case-insensitive now, because a published claim is lowercase and a heading is not.</w:t>
+      </w:r>
+    </w:p>
+    <w:p>
+      <w:pPr>
+        <w:pStyle w:val="Heading3"/>
+        <w:spacing w:after="140"/>
+      </w:pPr>
+      <w:r>
+        <w:t xml:space="preserve">One correct-state failure fixed</w:t>
+      </w:r>
+    </w:p>
+    <w:p>
+      <w:pPr>
+        <w:spacing w:after="140"/>
+      </w:pPr>
+      <w:r>
+        <w:t xml:space="preserve">The pre-commit hook blocked the deploy commit: </w:t>
+      </w:r>
+      <w:r>
+        <w:rPr>
+          <w:rFonts w:ascii="Consolas" w:hAnsi="Consolas"/>
+        </w:rPr>
+        <w:t xml:space="preserve">research/</w:t>
+      </w:r>
+      <w:r>
+        <w:t xml:space="preserve"> is deliberately excluded from the deploy, so on a branch cut from </w:t>
+      </w:r>
+      <w:r>
+        <w:rPr>
+          <w:rFonts w:ascii="Consolas" w:hAnsi="Consolas"/>
+        </w:rPr>
+        <w:t xml:space="preserve">main</w:t>
+      </w:r>
+      <w:r>
+        <w:t xml:space="preserve"> the three generated-document checks reported "file missing" and the geo check raised </w:t>
+      </w:r>
+      <w:r>
+        <w:rPr>
+          <w:rFonts w:ascii="Consolas" w:hAnsi="Consolas"/>
+        </w:rPr>
+        <w:t xml:space="preserve">FileNotFoundError</w:t>
+      </w:r>
+      <w:r>
+        <w:t xml:space="preserve">. None was a defect. Those checks now skip when </w:t>
+      </w:r>
+      <w:r>
+        <w:rPr>
+          <w:rFonts w:ascii="Consolas" w:hAnsi="Consolas"/>
+        </w:rPr>
+        <w:t xml:space="preserve">research/</w:t>
+      </w:r>
+      <w:r>
+        <w:t xml:space="preserve"> is absent, with the reason printed. Verified on a tree with </w:t>
+      </w:r>
+      <w:r>
+        <w:rPr>
+          <w:rFonts w:ascii="Consolas" w:hAnsi="Consolas"/>
+        </w:rPr>
+        <w:t xml:space="preserve">research/</w:t>
+      </w:r>
+      <w:r>
+        <w:t xml:space="preserve"> removed: 10 checks, 0 failed, 4 skipped.</w:t>
+      </w:r>
+    </w:p>
+    <w:p>
+      <w:pPr>
+        <w:pStyle w:val="Heading3"/>
+        <w:spacing w:after="140"/>
+      </w:pPr>
+      <w:r>
+        <w:t xml:space="preserve">Verification</w:t>
+      </w:r>
+    </w:p>
+    <w:p>
+      <w:pPr>
+        <w:spacing w:after="140"/>
+      </w:pPr>
+      <w:r>
+        <w:rPr>
+          <w:rFonts w:ascii="Consolas" w:hAnsi="Consolas"/>
+        </w:rPr>
+        <w:t xml:space="preserve">`</w:t>
+      </w:r>
+    </w:p>
+    <w:p>
+      <w:pPr>
+        <w:spacing w:after="140"/>
+      </w:pPr>
+      <w:r>
+        <w:t xml:space="preserve">guard                    10 checks, 0 failed (dev)  |  0 failed, 4 skipped (deploy branch)</w:t>
+      </w:r>
+    </w:p>
+    <w:p>
+      <w:pPr>
+        <w:spacing w:after="140"/>
+      </w:pPr>
+      <w:r>
+        <w:t xml:space="preserve">adversarial injections   8 of 8 caught</w:t>
+      </w:r>
+    </w:p>
+    <w:p>
+      <w:pPr>
+        <w:spacing w:after="140"/>
+      </w:pPr>
+      <w:r>
+        <w:t xml:space="preserve">headless, data present   45 of 45 spans live, 0 unmarked, sentinels visible on all 9 pages</w:t>
+      </w:r>
+    </w:p>
+    <w:p>
+      <w:pPr>
+        <w:spacing w:after="140"/>
+      </w:pPr>
+      <w:r>
+        <w:t xml:space="preserve">headless, endpoint 503   45 of 45 spans marked stale with a reason, 0 silently live</w:t>
+      </w:r>
+    </w:p>
+    <w:p>
+      <w:pPr>
+        <w:spacing w:after="140"/>
+      </w:pPr>
+      <w:r>
+        <w:t xml:space="preserve">live endpoint            9 scoped keys present, all 8 aliases equal to their scoped twin</w:t>
+      </w:r>
+    </w:p>
+    <w:p>
+      <w:pPr>
+        <w:spacing w:after="140"/>
+      </w:pPr>
+      <w:r>
+        <w:t xml:space="preserve">deployed pages           45 spans and 1 binder each, 0 copies of the frozen sentence</w:t>
+      </w:r>
+    </w:p>
+    <w:p>
+      <w:pPr>
+        <w:spacing w:after="140"/>
+      </w:pPr>
+      <w:r>
+        <w:rPr>
+          <w:rFonts w:ascii="Consolas" w:hAnsi="Consolas"/>
+        </w:rPr>
+        <w:t xml:space="preserve">`</w:t>
+      </w:r>
+    </w:p>
+    <w:p>
+      <w:pPr>
+        <w:pStyle w:val="Heading3"/>
+        <w:spacing w:after="140"/>
+      </w:pPr>
+      <w:r>
+        <w:t xml:space="preserve">Still open, deliberately</w:t>
+      </w:r>
+    </w:p>
+    <w:p>
+      <w:pPr>
+        <w:spacing w:after="140"/>
+      </w:pPr>
+      <w:r>
+        <w:t xml:space="preserve">Four figures next to panel vocabulary are allowlisted rather than bound, each with a written reason: the Rung 2a comparison results (</w:t>
+      </w:r>
+      <w:r>
+        <w:rPr>
+          <w:rFonts w:ascii="Consolas" w:hAnsi="Consolas"/>
+        </w:rPr>
+        <w:t xml:space="preserve">21 reviewers</w:t>
+      </w:r>
+      <w:r>
+        <w:t xml:space="preserve">, </w:t>
+      </w:r>
+      <w:r>
+        <w:rPr>
+          <w:rFonts w:ascii="Consolas" w:hAnsi="Consolas"/>
+        </w:rPr>
+        <w:t xml:space="preserve">16 labels from 3 reviewers</w:t>
+      </w:r>
+      <w:r>
+        <w:t xml:space="preserve">), the reliability set size (</w:t>
+      </w:r>
+      <w:r>
+        <w:rPr>
+          <w:rFonts w:ascii="Consolas" w:hAnsi="Consolas"/>
+        </w:rPr>
+        <w:t xml:space="preserve">62 trained reviewers</w:t>
+      </w:r>
+      <w:r>
+        <w:t xml:space="preserve">), and one count of failure patterns. </w:t>
+      </w:r>
+      <w:r>
+        <w:rPr>
+          <w:rFonts w:ascii="Consolas" w:hAnsi="Consolas"/>
+        </w:rPr>
+        <w:t xml:space="preserve">api/panel-stats.js</w:t>
+      </w:r>
+      <w:r>
+        <w:t xml:space="preserve"> returns no key for any of them, so there is nothing to bind them to. Binding them would mean adding Rung 2a figures to the endpoint, which is a separate decision.</w:t>
       </w:r>
     </w:p>
     <w:sectPr>

</xml_diff>